<commit_message>
fichier bien classer + msj du readme
</commit_message>
<xml_diff>
--- a/docs/MangaShelf_Wireframes.docx
+++ b/docs/MangaShelf_Wireframes.docx
@@ -1892,6 +1892,7 @@
         <w:rPr>
           <w:b/>
           <w:bCs/>
+          <w:noProof/>
           <w:sz w:val="26"/>
           <w:szCs w:val="26"/>
         </w:rPr>
@@ -2184,6 +2185,7 @@
         <w:rPr>
           <w:b/>
           <w:bCs/>
+          <w:noProof/>
           <w:sz w:val="26"/>
           <w:szCs w:val="26"/>
         </w:rPr>
@@ -2467,6 +2469,7 @@
         <w:rPr>
           <w:b/>
           <w:bCs/>
+          <w:noProof/>
           <w:sz w:val="26"/>
           <w:szCs w:val="26"/>
         </w:rPr>
@@ -2507,9 +2510,526 @@
         </w:drawing>
       </w:r>
     </w:p>
+    <w:p>
+      <w:pPr>
+        <w:rPr>
+          <w:b/>
+          <w:bCs/>
+          <w:sz w:val="26"/>
+          <w:szCs w:val="26"/>
+        </w:rPr>
+      </w:pPr>
+    </w:p>
+    <w:p>
+      <w:pPr>
+        <w:rPr>
+          <w:b/>
+          <w:bCs/>
+          <w:sz w:val="26"/>
+          <w:szCs w:val="26"/>
+        </w:rPr>
+      </w:pPr>
+    </w:p>
+    <w:p>
+      <w:pPr>
+        <w:rPr>
+          <w:b/>
+          <w:bCs/>
+          <w:sz w:val="26"/>
+          <w:szCs w:val="26"/>
+        </w:rPr>
+      </w:pPr>
+    </w:p>
+    <w:p>
+      <w:pPr>
+        <w:rPr>
+          <w:b/>
+          <w:bCs/>
+          <w:sz w:val="26"/>
+          <w:szCs w:val="26"/>
+        </w:rPr>
+      </w:pPr>
+    </w:p>
+    <w:p>
+      <w:pPr>
+        <w:rPr>
+          <w:b/>
+          <w:bCs/>
+          <w:sz w:val="26"/>
+          <w:szCs w:val="26"/>
+        </w:rPr>
+      </w:pPr>
+    </w:p>
+    <w:p>
+      <w:pPr>
+        <w:rPr>
+          <w:b/>
+          <w:bCs/>
+          <w:sz w:val="26"/>
+          <w:szCs w:val="26"/>
+        </w:rPr>
+      </w:pPr>
+    </w:p>
+    <w:p>
+      <w:pPr>
+        <w:rPr>
+          <w:b/>
+          <w:bCs/>
+          <w:sz w:val="26"/>
+          <w:szCs w:val="26"/>
+        </w:rPr>
+      </w:pPr>
+    </w:p>
+    <w:p>
+      <w:pPr>
+        <w:rPr>
+          <w:b/>
+          <w:bCs/>
+          <w:sz w:val="26"/>
+          <w:szCs w:val="26"/>
+        </w:rPr>
+      </w:pPr>
+    </w:p>
+    <w:p>
+      <w:pPr>
+        <w:rPr>
+          <w:b/>
+          <w:bCs/>
+          <w:sz w:val="26"/>
+          <w:szCs w:val="26"/>
+        </w:rPr>
+      </w:pPr>
+    </w:p>
+    <w:p>
+      <w:pPr>
+        <w:rPr>
+          <w:b/>
+          <w:bCs/>
+          <w:sz w:val="26"/>
+          <w:szCs w:val="26"/>
+        </w:rPr>
+      </w:pPr>
+    </w:p>
+    <w:p>
+      <w:pPr>
+        <w:rPr>
+          <w:b/>
+          <w:bCs/>
+          <w:sz w:val="26"/>
+          <w:szCs w:val="26"/>
+        </w:rPr>
+      </w:pPr>
+    </w:p>
+    <w:p>
+      <w:pPr>
+        <w:rPr>
+          <w:b/>
+          <w:bCs/>
+          <w:sz w:val="26"/>
+          <w:szCs w:val="26"/>
+        </w:rPr>
+      </w:pPr>
+    </w:p>
+    <w:p>
+      <w:pPr>
+        <w:rPr>
+          <w:b/>
+          <w:bCs/>
+          <w:sz w:val="26"/>
+          <w:szCs w:val="26"/>
+        </w:rPr>
+      </w:pPr>
+    </w:p>
+    <w:p>
+      <w:pPr>
+        <w:rPr>
+          <w:b/>
+          <w:bCs/>
+          <w:sz w:val="26"/>
+          <w:szCs w:val="26"/>
+        </w:rPr>
+      </w:pPr>
+    </w:p>
+    <w:p>
+      <w:pPr>
+        <w:rPr>
+          <w:b/>
+          <w:bCs/>
+          <w:sz w:val="26"/>
+          <w:szCs w:val="26"/>
+        </w:rPr>
+      </w:pPr>
+    </w:p>
+    <w:p>
+      <w:pPr>
+        <w:rPr>
+          <w:b/>
+          <w:bCs/>
+          <w:sz w:val="26"/>
+          <w:szCs w:val="26"/>
+        </w:rPr>
+      </w:pPr>
+    </w:p>
+    <w:p>
+      <w:pPr>
+        <w:rPr>
+          <w:b/>
+          <w:bCs/>
+          <w:sz w:val="26"/>
+          <w:szCs w:val="26"/>
+        </w:rPr>
+      </w:pPr>
+    </w:p>
+    <w:p>
+      <w:pPr>
+        <w:rPr>
+          <w:b/>
+          <w:bCs/>
+          <w:sz w:val="26"/>
+          <w:szCs w:val="26"/>
+        </w:rPr>
+      </w:pPr>
+    </w:p>
+    <w:p>
+      <w:pPr>
+        <w:rPr>
+          <w:b/>
+          <w:bCs/>
+          <w:sz w:val="26"/>
+          <w:szCs w:val="26"/>
+        </w:rPr>
+      </w:pPr>
+    </w:p>
+    <w:p>
+      <w:pPr>
+        <w:rPr>
+          <w:b/>
+          <w:bCs/>
+          <w:sz w:val="26"/>
+          <w:szCs w:val="26"/>
+        </w:rPr>
+      </w:pPr>
+    </w:p>
+    <w:p>
+      <w:pPr>
+        <w:rPr>
+          <w:b/>
+          <w:bCs/>
+          <w:sz w:val="26"/>
+          <w:szCs w:val="26"/>
+        </w:rPr>
+      </w:pPr>
+    </w:p>
+    <w:p>
+      <w:pPr>
+        <w:rPr>
+          <w:b/>
+          <w:bCs/>
+          <w:sz w:val="26"/>
+          <w:szCs w:val="26"/>
+        </w:rPr>
+      </w:pPr>
+    </w:p>
+    <w:p>
+      <w:pPr>
+        <w:rPr>
+          <w:b/>
+          <w:bCs/>
+          <w:sz w:val="32"/>
+          <w:szCs w:val="32"/>
+        </w:rPr>
+      </w:pPr>
+      <w:r>
+        <w:rPr>
+          <w:b/>
+          <w:bCs/>
+          <w:sz w:val="32"/>
+          <w:szCs w:val="32"/>
+        </w:rPr>
+        <w:lastRenderedPageBreak/>
+        <w:t>Les wireframes admin responsive</w:t>
+      </w:r>
+    </w:p>
+    <w:p>
+      <w:pPr>
+        <w:rPr>
+          <w:b/>
+          <w:bCs/>
+          <w:sz w:val="32"/>
+          <w:szCs w:val="32"/>
+        </w:rPr>
+      </w:pPr>
+    </w:p>
+    <w:p>
+      <w:pPr>
+        <w:rPr>
+          <w:b/>
+          <w:bCs/>
+          <w:sz w:val="26"/>
+          <w:szCs w:val="26"/>
+        </w:rPr>
+      </w:pPr>
+      <w:r>
+        <w:rPr>
+          <w:b/>
+          <w:bCs/>
+          <w:sz w:val="26"/>
+          <w:szCs w:val="26"/>
+        </w:rPr>
+        <w:t xml:space="preserve">Page Admin 1 – Login </w:t>
+      </w:r>
+    </w:p>
+    <w:p>
+      <w:pPr>
+        <w:rPr>
+          <w:b/>
+          <w:bCs/>
+          <w:sz w:val="26"/>
+          <w:szCs w:val="26"/>
+        </w:rPr>
+      </w:pPr>
+    </w:p>
+    <w:p>
+      <w:pPr>
+        <w:rPr>
+          <w:b/>
+          <w:bCs/>
+          <w:sz w:val="26"/>
+          <w:szCs w:val="26"/>
+        </w:rPr>
+      </w:pPr>
+      <w:r>
+        <w:rPr>
+          <w:b/>
+          <w:bCs/>
+          <w:sz w:val="26"/>
+          <w:szCs w:val="26"/>
+        </w:rPr>
+        <w:drawing>
+          <wp:inline distT="0" distB="0" distL="0" distR="0" wp14:anchorId="70D4A9FB" wp14:editId="2989FEA4">
+            <wp:extent cx="4381880" cy="3528366"/>
+            <wp:effectExtent l="0" t="0" r="0" b="0"/>
+            <wp:docPr id="473950103" name="Image 1"/>
+            <wp:cNvGraphicFramePr>
+              <a:graphicFrameLocks xmlns:a="http://schemas.openxmlformats.org/drawingml/2006/main" noChangeAspect="1"/>
+            </wp:cNvGraphicFramePr>
+            <a:graphic xmlns:a="http://schemas.openxmlformats.org/drawingml/2006/main">
+              <a:graphicData uri="http://schemas.openxmlformats.org/drawingml/2006/picture">
+                <pic:pic xmlns:pic="http://schemas.openxmlformats.org/drawingml/2006/picture">
+                  <pic:nvPicPr>
+                    <pic:cNvPr id="473950103" name=""/>
+                    <pic:cNvPicPr/>
+                  </pic:nvPicPr>
+                  <pic:blipFill>
+                    <a:blip r:embed="rId15"/>
+                    <a:stretch>
+                      <a:fillRect/>
+                    </a:stretch>
+                  </pic:blipFill>
+                  <pic:spPr>
+                    <a:xfrm>
+                      <a:off x="0" y="0"/>
+                      <a:ext cx="4381880" cy="3528366"/>
+                    </a:xfrm>
+                    <a:prstGeom prst="rect">
+                      <a:avLst/>
+                    </a:prstGeom>
+                  </pic:spPr>
+                </pic:pic>
+              </a:graphicData>
+            </a:graphic>
+          </wp:inline>
+        </w:drawing>
+      </w:r>
+    </w:p>
+    <w:p>
+      <w:pPr>
+        <w:rPr>
+          <w:b/>
+          <w:bCs/>
+          <w:sz w:val="26"/>
+          <w:szCs w:val="26"/>
+        </w:rPr>
+      </w:pPr>
+    </w:p>
+    <w:p>
+      <w:pPr>
+        <w:rPr>
+          <w:b/>
+          <w:bCs/>
+          <w:sz w:val="26"/>
+          <w:szCs w:val="26"/>
+        </w:rPr>
+      </w:pPr>
+    </w:p>
+    <w:p>
+      <w:pPr>
+        <w:rPr>
+          <w:b/>
+          <w:bCs/>
+          <w:sz w:val="26"/>
+          <w:szCs w:val="26"/>
+        </w:rPr>
+      </w:pPr>
+      <w:r>
+        <w:rPr>
+          <w:b/>
+          <w:bCs/>
+          <w:sz w:val="26"/>
+          <w:szCs w:val="26"/>
+        </w:rPr>
+        <w:t xml:space="preserve">Page Admin 2 – Dashboard </w:t>
+      </w:r>
+    </w:p>
+    <w:p>
+      <w:pPr>
+        <w:rPr>
+          <w:b/>
+          <w:bCs/>
+          <w:sz w:val="26"/>
+          <w:szCs w:val="26"/>
+        </w:rPr>
+      </w:pPr>
+    </w:p>
+    <w:p>
+      <w:pPr>
+        <w:rPr>
+          <w:b/>
+          <w:bCs/>
+          <w:sz w:val="26"/>
+          <w:szCs w:val="26"/>
+        </w:rPr>
+      </w:pPr>
+      <w:r>
+        <w:rPr>
+          <w:b/>
+          <w:bCs/>
+          <w:sz w:val="26"/>
+          <w:szCs w:val="26"/>
+        </w:rPr>
+        <w:drawing>
+          <wp:inline distT="0" distB="0" distL="0" distR="0" wp14:anchorId="2ED98F4B" wp14:editId="6B5AFB3F">
+            <wp:extent cx="4473328" cy="3901778"/>
+            <wp:effectExtent l="0" t="0" r="3810" b="3810"/>
+            <wp:docPr id="418398840" name="Image 1"/>
+            <wp:cNvGraphicFramePr>
+              <a:graphicFrameLocks xmlns:a="http://schemas.openxmlformats.org/drawingml/2006/main" noChangeAspect="1"/>
+            </wp:cNvGraphicFramePr>
+            <a:graphic xmlns:a="http://schemas.openxmlformats.org/drawingml/2006/main">
+              <a:graphicData uri="http://schemas.openxmlformats.org/drawingml/2006/picture">
+                <pic:pic xmlns:pic="http://schemas.openxmlformats.org/drawingml/2006/picture">
+                  <pic:nvPicPr>
+                    <pic:cNvPr id="418398840" name=""/>
+                    <pic:cNvPicPr/>
+                  </pic:nvPicPr>
+                  <pic:blipFill>
+                    <a:blip r:embed="rId16"/>
+                    <a:stretch>
+                      <a:fillRect/>
+                    </a:stretch>
+                  </pic:blipFill>
+                  <pic:spPr>
+                    <a:xfrm>
+                      <a:off x="0" y="0"/>
+                      <a:ext cx="4473328" cy="3901778"/>
+                    </a:xfrm>
+                    <a:prstGeom prst="rect">
+                      <a:avLst/>
+                    </a:prstGeom>
+                  </pic:spPr>
+                </pic:pic>
+              </a:graphicData>
+            </a:graphic>
+          </wp:inline>
+        </w:drawing>
+      </w:r>
+    </w:p>
+    <w:p>
+      <w:pPr>
+        <w:rPr>
+          <w:b/>
+          <w:bCs/>
+          <w:sz w:val="26"/>
+          <w:szCs w:val="26"/>
+        </w:rPr>
+      </w:pPr>
+      <w:r>
+        <w:rPr>
+          <w:b/>
+          <w:bCs/>
+          <w:sz w:val="26"/>
+          <w:szCs w:val="26"/>
+        </w:rPr>
+        <w:lastRenderedPageBreak/>
+        <w:t xml:space="preserve">Page Admin 3 - Formulaire création / édition manga </w:t>
+      </w:r>
+    </w:p>
+    <w:p>
+      <w:pPr>
+        <w:rPr>
+          <w:b/>
+          <w:bCs/>
+          <w:sz w:val="26"/>
+          <w:szCs w:val="26"/>
+        </w:rPr>
+      </w:pPr>
+    </w:p>
+    <w:p>
+      <w:pPr>
+        <w:rPr>
+          <w:b/>
+          <w:bCs/>
+          <w:sz w:val="26"/>
+          <w:szCs w:val="26"/>
+        </w:rPr>
+      </w:pPr>
+      <w:r>
+        <w:rPr>
+          <w:b/>
+          <w:bCs/>
+          <w:sz w:val="26"/>
+          <w:szCs w:val="26"/>
+        </w:rPr>
+        <w:drawing>
+          <wp:inline distT="0" distB="0" distL="0" distR="0" wp14:anchorId="25711D96" wp14:editId="7F88C2F4">
+            <wp:extent cx="4473328" cy="4511431"/>
+            <wp:effectExtent l="0" t="0" r="3810" b="3810"/>
+            <wp:docPr id="1218227262" name="Image 1"/>
+            <wp:cNvGraphicFramePr>
+              <a:graphicFrameLocks xmlns:a="http://schemas.openxmlformats.org/drawingml/2006/main" noChangeAspect="1"/>
+            </wp:cNvGraphicFramePr>
+            <a:graphic xmlns:a="http://schemas.openxmlformats.org/drawingml/2006/main">
+              <a:graphicData uri="http://schemas.openxmlformats.org/drawingml/2006/picture">
+                <pic:pic xmlns:pic="http://schemas.openxmlformats.org/drawingml/2006/picture">
+                  <pic:nvPicPr>
+                    <pic:cNvPr id="1218227262" name=""/>
+                    <pic:cNvPicPr/>
+                  </pic:nvPicPr>
+                  <pic:blipFill>
+                    <a:blip r:embed="rId17"/>
+                    <a:stretch>
+                      <a:fillRect/>
+                    </a:stretch>
+                  </pic:blipFill>
+                  <pic:spPr>
+                    <a:xfrm>
+                      <a:off x="0" y="0"/>
+                      <a:ext cx="4473328" cy="4511431"/>
+                    </a:xfrm>
+                    <a:prstGeom prst="rect">
+                      <a:avLst/>
+                    </a:prstGeom>
+                  </pic:spPr>
+                </pic:pic>
+              </a:graphicData>
+            </a:graphic>
+          </wp:inline>
+        </w:drawing>
+      </w:r>
+    </w:p>
     <w:sectPr>
-      <w:headerReference w:type="default" r:id="rId15"/>
-      <w:footerReference w:type="default" r:id="rId16"/>
+      <w:headerReference w:type="default" r:id="rId18"/>
+      <w:footerReference w:type="default" r:id="rId19"/>
       <w:pgSz w:w="11906" w:h="16838"/>
       <w:pgMar w:top="1200" w:right="1200" w:bottom="1200" w:left="1200" w:header="708" w:footer="708" w:gutter="0"/>
       <w:cols w:space="720"/>
@@ -3298,6 +3818,7 @@
   <w:style w:type="character" w:default="1" w:styleId="Policepardfaut">
     <w:name w:val="Default Paragraph Font"/>
     <w:uiPriority w:val="1"/>
+    <w:semiHidden/>
     <w:unhideWhenUsed/>
   </w:style>
   <w:style w:type="table" w:default="1" w:styleId="TableauNormal">

</xml_diff>